<commit_message>
Docs 04/05: sync schema and endpoints with the code (invites.space_ids, step sentinel, audit_log key, auth nonce, batch invites, accept/resend, slug-available, spaces detail, templates, published 409)
Co-Authored-By: Claude Fable 5.1 <noreply@anthropic.com>
Claude-Session: https://claude.ai/code/session_01RD5kD4obV2Jan7tMKpiqPQ
</commit_message>
<xml_diff>
--- a/Documentation/04-Database-Schema.docx
+++ b/Documentation/04-Database-Schema.docx
@@ -65,7 +65,7 @@
           <w:sz w:val="20"/>
           <w:szCs w:val="20"/>
         </w:rPr>
-        <w:t>Version 2.0  ·  Project documentation  ·  2026</w:t>
+        <w:t>Version 2.1  ·  Project documentation  ·  2026</w:t>
       </w:r>
     </w:p>
     <w:p>
@@ -2305,6 +2305,22 @@
           <w:sz w:val="16"/>
           <w:szCs w:val="16"/>
         </w:rPr>
+        <w:t xml:space="preserve">  space_ids     json null,                  -- spaces joined on acceptance (S3); added in code 18 Sep 2026</w:t>
+      </w:r>
+    </w:p>
+    <w:p>
+      <w:pPr>
+        <w:shd w:fill="F4F5F7" w:val="clear"/>
+        <w:spacing w:after="0" w:before="0" w:line="240"/>
+        <w:ind w:left="200" w:right="200"/>
+      </w:pPr>
+      <w:r>
+        <w:rPr>
+          <w:rFonts w:ascii="Consolas" w:cs="Consolas" w:eastAsia="Consolas" w:hAnsi="Consolas"/>
+          <w:color w:val="24292F"/>
+          <w:sz w:val="16"/>
+          <w:szCs w:val="16"/>
+        </w:rPr>
         <w:t xml:space="preserve">  expires_at    timestamp not null,</w:t>
       </w:r>
     </w:p>
@@ -2465,16 +2481,15 @@
           <w:szCs w:val="18"/>
           <w:shd w:fill="F4F5F7" w:val="clear"/>
         </w:rPr>
-        <w:t xml:space="preserve">token_hash</w:t>
-      </w:r>
-      <w:r>
-        <w:rPr>
-          <w:rFonts w:ascii="Calibri" w:cs="Calibri" w:eastAsia="Calibri" w:hAnsi="Calibri"/>
-          <w:color w:val="1A1A1A"/>
-          <w:sz w:val="20"/>
-          <w:szCs w:val="20"/>
-        </w:rPr>
-        <w:t xml:space="preserve"> stores a SHA-256 of the invite token, never the token itself. The raw value exists only in the emailed link.</w:t>
+        <w:t>token_hash stores a SHA-256 of the invite token, never the token itself. The raw value exists only in the emailed link. space_ids carries the spaces an invitee joins on acceptance, because screen S3 assigns spaces at invitation time.</w:t>
+      </w:r>
+      <w:r>
+        <w:rPr>
+          <w:rFonts w:ascii="Calibri" w:cs="Calibri" w:eastAsia="Calibri" w:hAnsi="Calibri"/>
+          <w:color w:val="1A1A1A"/>
+          <w:sz w:val="20"/>
+          <w:szCs w:val="20"/>
+        </w:rPr>
       </w:r>
     </w:p>
     <w:p>
@@ -4341,7 +4356,7 @@
           <w:sz w:val="20"/>
           <w:szCs w:val="20"/>
         </w:rPr>
-        <w:t xml:space="preserve">MySQL caveat.</w:t>
+        <w:t>The sentinel is the safer choice and is what the migration uses: version_id is char(26) not null default '0', and the working copy's steps carry '0'. Approval copies the rows under the new version's id.</w:t>
       </w:r>
       <w:r>
         <w:rPr>
@@ -4352,7 +4367,6 @@
           <w:sz w:val="20"/>
           <w:szCs w:val="20"/>
         </w:rPr>
-        <w:t xml:space="preserve"> </w:t>
       </w:r>
       <w:r>
         <w:rPr>
@@ -4364,7 +4378,6 @@
           <w:szCs w:val="18"/>
           <w:shd w:fill="F4F5F7" w:val="clear"/>
         </w:rPr>
-        <w:t xml:space="preserve">unique key (document_id, version_id, position)</w:t>
       </w:r>
       <w:r>
         <w:rPr>
@@ -4375,7 +4388,6 @@
           <w:sz w:val="20"/>
           <w:szCs w:val="20"/>
         </w:rPr>
-        <w:t xml:space="preserve"> does not prevent duplicate positions on the working draft, because </w:t>
       </w:r>
       <w:r>
         <w:rPr>
@@ -4387,7 +4399,6 @@
           <w:szCs w:val="18"/>
           <w:shd w:fill="F4F5F7" w:val="clear"/>
         </w:rPr>
-        <w:t xml:space="preserve">version_id</w:t>
       </w:r>
       <w:r>
         <w:rPr>
@@ -4398,7 +4409,6 @@
           <w:sz w:val="20"/>
           <w:szCs w:val="20"/>
         </w:rPr>
-        <w:t xml:space="preserve"> is </w:t>
       </w:r>
       <w:r>
         <w:rPr>
@@ -4410,7 +4420,6 @@
           <w:szCs w:val="18"/>
           <w:shd w:fill="F4F5F7" w:val="clear"/>
         </w:rPr>
-        <w:t xml:space="preserve">NULL</w:t>
       </w:r>
       <w:r>
         <w:rPr>
@@ -4421,7 +4430,6 @@
           <w:sz w:val="20"/>
           <w:szCs w:val="20"/>
         </w:rPr>
-        <w:t xml:space="preserve"> there and MySQL treats each </w:t>
       </w:r>
       <w:r>
         <w:rPr>
@@ -4433,7 +4441,6 @@
           <w:szCs w:val="18"/>
           <w:shd w:fill="F4F5F7" w:val="clear"/>
         </w:rPr>
-        <w:t xml:space="preserve">NULL</w:t>
       </w:r>
       <w:r>
         <w:rPr>
@@ -4444,7 +4451,6 @@
           <w:sz w:val="20"/>
           <w:szCs w:val="20"/>
         </w:rPr>
-        <w:t xml:space="preserve"> as distinct. Enforce working-draft position uniqueness in the application, or use the sentinel </w:t>
       </w:r>
       <w:r>
         <w:rPr>
@@ -4456,7 +4462,6 @@
           <w:szCs w:val="18"/>
           <w:shd w:fill="F4F5F7" w:val="clear"/>
         </w:rPr>
-        <w:t xml:space="preserve">'0'</w:t>
       </w:r>
       <w:r>
         <w:rPr>
@@ -4467,7 +4472,6 @@
           <w:sz w:val="20"/>
           <w:szCs w:val="20"/>
         </w:rPr>
-        <w:t xml:space="preserve"> instead of </w:t>
       </w:r>
       <w:r>
         <w:rPr>
@@ -4479,7 +4483,6 @@
           <w:szCs w:val="18"/>
           <w:shd w:fill="F4F5F7" w:val="clear"/>
         </w:rPr>
-        <w:t xml:space="preserve">NULL</w:t>
       </w:r>
       <w:r>
         <w:rPr>
@@ -4490,7 +4493,6 @@
           <w:sz w:val="20"/>
           <w:szCs w:val="20"/>
         </w:rPr>
-        <w:t xml:space="preserve"> for the working copy. The sentinel is the safer choice and is what the migration uses.</w:t>
       </w:r>
     </w:p>
     <w:p>
@@ -8953,6 +8955,22 @@
           <w:szCs w:val="16"/>
         </w:rPr>
         <w:t xml:space="preserve">revoke update, delete on sop_app.audit_log from 'app_user'@'%';</w:t>
+      </w:r>
+    </w:p>
+    <w:p>
+      <w:pPr>
+        <w:shd w:fill="F4F5F7" w:val="clear"/>
+        <w:spacing w:after="140" w:before="100" w:line="240"/>
+        <w:ind w:left="200" w:right="200"/>
+      </w:pPr>
+      <w:r>
+        <w:rPr>
+          <w:rFonts w:ascii="Consolas" w:cs="Consolas" w:eastAsia="Consolas" w:hAnsi="Consolas"/>
+          <w:color w:val="24292F"/>
+          <w:sz w:val="16"/>
+          <w:szCs w:val="16"/>
+        </w:rPr>
+        <w:t>In code the primary key is Laravel's bigint auto-increment id (not a ULID), the model has no updated_at, and every write goes through Audit::record(); there is no update or delete path in the application.</w:t>
       </w:r>
     </w:p>
     <w:p>

</xml_diff>